<commit_message>
Deploying to gh-pages from @ ehrlinger/hvtiRtables@b65a44125dd5277147033eb2896206b60f861290 🚀
</commit_message>
<xml_diff>
--- a/articles/table-styles-compare.docx
+++ b/articles/table-styles-compare.docx
@@ -1847,109 +1847,109 @@
                 <w:strike w:val="false"/>
                 <w:color w:val="000000"/>
               </w:rPr>
-              <w:t xml:space="preserve">53 (27)</w:t>
-            </w:r>
-          </w:p>
-        </w:tc>
-        <w:tc>
-          <w:tcPr>
-            <w:tcBorders>
-              <w:bottom w:val="single" w:sz="4" w:space="0" w:color="000000"/>
-              <w:top w:val="single" w:sz="4" w:space="0" w:color="000000"/>
-              <w:left w:val="single" w:sz="4" w:space="0" w:color="000000"/>
-              <w:right w:val="single" w:sz="4" w:space="0" w:color="000000"/>
-            </w:tcBorders>
-            <w:shd w:val="clear" w:color="auto" w:fill="FFFFFF"/>
-            <w:tcMar>
-              <w:top w:w="0" w:type="dxa"/>
-              <w:bottom w:w="0" w:type="dxa"/>
-              <w:left w:w="0" w:type="dxa"/>
-              <w:right w:w="0" w:type="dxa"/>
-            </w:tcMar>
-            <w:vAlign w:val="center"/>
-          </w:tcPr>
-          <w:p>
-            <w:pPr>
-              <w:pStyle w:val="Normal"/>
-              <w:jc w:val="center"/>
-              <w:pBdr>
-                <w:bottom w:val="none" w:sz="0" w:space="0" w:color="000000"/>
-                <w:top w:val="none" w:sz="0" w:space="0" w:color="000000"/>
-                <w:left w:val="none" w:sz="0" w:space="0" w:color="000000"/>
-                <w:right w:val="none" w:sz="0" w:space="0" w:color="000000"/>
-              </w:pBdr>
-              <w:spacing w:after="100" w:before="100" w:line="240"/>
-              <w:ind w:left="100" w:right="100" w:firstLine="0" w:firstLineChars="0"/>
-              <w:rPr>
-                <w:rFonts/>
-                <w:i w:val="false"/>
-                <w:b w:val="false"/>
-                <w:u w:val="none"/>
-                <w:strike w:val="false"/>
-                <w:color w:val="000000"/>
-              </w:rPr>
-            </w:pPr>
-            <w:r>
-              <w:rPr>
-                <w:rFonts/>
-                <w:i w:val="false"/>
-                <w:b w:val="false"/>
-                <w:u w:val="none"/>
-                <w:strike w:val="false"/>
-                <w:color w:val="000000"/>
-              </w:rPr>
-              <w:t xml:space="preserve">28 (29)</w:t>
-            </w:r>
-          </w:p>
-        </w:tc>
-        <w:tc>
-          <w:tcPr>
-            <w:tcBorders>
-              <w:bottom w:val="single" w:sz="4" w:space="0" w:color="000000"/>
-              <w:top w:val="single" w:sz="4" w:space="0" w:color="000000"/>
-              <w:left w:val="single" w:sz="4" w:space="0" w:color="000000"/>
-              <w:right w:val="single" w:sz="4" w:space="0" w:color="000000"/>
-            </w:tcBorders>
-            <w:shd w:val="clear" w:color="auto" w:fill="FFFFFF"/>
-            <w:tcMar>
-              <w:top w:w="0" w:type="dxa"/>
-              <w:bottom w:w="0" w:type="dxa"/>
-              <w:left w:w="0" w:type="dxa"/>
-              <w:right w:w="0" w:type="dxa"/>
-            </w:tcMar>
-            <w:vAlign w:val="center"/>
-          </w:tcPr>
-          <w:p>
-            <w:pPr>
-              <w:pStyle w:val="Normal"/>
-              <w:jc w:val="center"/>
-              <w:pBdr>
-                <w:bottom w:val="none" w:sz="0" w:space="0" w:color="000000"/>
-                <w:top w:val="none" w:sz="0" w:space="0" w:color="000000"/>
-                <w:left w:val="none" w:sz="0" w:space="0" w:color="000000"/>
-                <w:right w:val="none" w:sz="0" w:space="0" w:color="000000"/>
-              </w:pBdr>
-              <w:spacing w:after="100" w:before="100" w:line="240"/>
-              <w:ind w:left="100" w:right="100" w:firstLine="0" w:firstLineChars="0"/>
-              <w:rPr>
-                <w:rFonts/>
-                <w:i w:val="false"/>
-                <w:b w:val="false"/>
-                <w:u w:val="none"/>
-                <w:strike w:val="false"/>
-                <w:color w:val="000000"/>
-              </w:rPr>
-            </w:pPr>
-            <w:r>
-              <w:rPr>
-                <w:rFonts/>
-                <w:i w:val="false"/>
-                <w:b w:val="false"/>
-                <w:u w:val="none"/>
-                <w:strike w:val="false"/>
-                <w:color w:val="000000"/>
-              </w:rPr>
-              <w:t xml:space="preserve">25 (25)</w:t>
+              <w:t xml:space="preserve">53(27)</w:t>
+            </w:r>
+          </w:p>
+        </w:tc>
+        <w:tc>
+          <w:tcPr>
+            <w:tcBorders>
+              <w:bottom w:val="single" w:sz="4" w:space="0" w:color="000000"/>
+              <w:top w:val="single" w:sz="4" w:space="0" w:color="000000"/>
+              <w:left w:val="single" w:sz="4" w:space="0" w:color="000000"/>
+              <w:right w:val="single" w:sz="4" w:space="0" w:color="000000"/>
+            </w:tcBorders>
+            <w:shd w:val="clear" w:color="auto" w:fill="FFFFFF"/>
+            <w:tcMar>
+              <w:top w:w="0" w:type="dxa"/>
+              <w:bottom w:w="0" w:type="dxa"/>
+              <w:left w:w="0" w:type="dxa"/>
+              <w:right w:w="0" w:type="dxa"/>
+            </w:tcMar>
+            <w:vAlign w:val="center"/>
+          </w:tcPr>
+          <w:p>
+            <w:pPr>
+              <w:pStyle w:val="Normal"/>
+              <w:jc w:val="center"/>
+              <w:pBdr>
+                <w:bottom w:val="none" w:sz="0" w:space="0" w:color="000000"/>
+                <w:top w:val="none" w:sz="0" w:space="0" w:color="000000"/>
+                <w:left w:val="none" w:sz="0" w:space="0" w:color="000000"/>
+                <w:right w:val="none" w:sz="0" w:space="0" w:color="000000"/>
+              </w:pBdr>
+              <w:spacing w:after="100" w:before="100" w:line="240"/>
+              <w:ind w:left="100" w:right="100" w:firstLine="0" w:firstLineChars="0"/>
+              <w:rPr>
+                <w:rFonts/>
+                <w:i w:val="false"/>
+                <w:b w:val="false"/>
+                <w:u w:val="none"/>
+                <w:strike w:val="false"/>
+                <w:color w:val="000000"/>
+              </w:rPr>
+            </w:pPr>
+            <w:r>
+              <w:rPr>
+                <w:rFonts/>
+                <w:i w:val="false"/>
+                <w:b w:val="false"/>
+                <w:u w:val="none"/>
+                <w:strike w:val="false"/>
+                <w:color w:val="000000"/>
+              </w:rPr>
+              <w:t xml:space="preserve">28(29)</w:t>
+            </w:r>
+          </w:p>
+        </w:tc>
+        <w:tc>
+          <w:tcPr>
+            <w:tcBorders>
+              <w:bottom w:val="single" w:sz="4" w:space="0" w:color="000000"/>
+              <w:top w:val="single" w:sz="4" w:space="0" w:color="000000"/>
+              <w:left w:val="single" w:sz="4" w:space="0" w:color="000000"/>
+              <w:right w:val="single" w:sz="4" w:space="0" w:color="000000"/>
+            </w:tcBorders>
+            <w:shd w:val="clear" w:color="auto" w:fill="FFFFFF"/>
+            <w:tcMar>
+              <w:top w:w="0" w:type="dxa"/>
+              <w:bottom w:w="0" w:type="dxa"/>
+              <w:left w:w="0" w:type="dxa"/>
+              <w:right w:w="0" w:type="dxa"/>
+            </w:tcMar>
+            <w:vAlign w:val="center"/>
+          </w:tcPr>
+          <w:p>
+            <w:pPr>
+              <w:pStyle w:val="Normal"/>
+              <w:jc w:val="center"/>
+              <w:pBdr>
+                <w:bottom w:val="none" w:sz="0" w:space="0" w:color="000000"/>
+                <w:top w:val="none" w:sz="0" w:space="0" w:color="000000"/>
+                <w:left w:val="none" w:sz="0" w:space="0" w:color="000000"/>
+                <w:right w:val="none" w:sz="0" w:space="0" w:color="000000"/>
+              </w:pBdr>
+              <w:spacing w:after="100" w:before="100" w:line="240"/>
+              <w:ind w:left="100" w:right="100" w:firstLine="0" w:firstLineChars="0"/>
+              <w:rPr>
+                <w:rFonts/>
+                <w:i w:val="false"/>
+                <w:b w:val="false"/>
+                <w:u w:val="none"/>
+                <w:strike w:val="false"/>
+                <w:color w:val="000000"/>
+              </w:rPr>
+            </w:pPr>
+            <w:r>
+              <w:rPr>
+                <w:rFonts/>
+                <w:i w:val="false"/>
+                <w:b w:val="false"/>
+                <w:u w:val="none"/>
+                <w:strike w:val="false"/>
+                <w:color w:val="000000"/>
+              </w:rPr>
+              <w:t xml:space="preserve">25(25)</w:t>
             </w:r>
           </w:p>
         </w:tc>
@@ -2159,109 +2159,109 @@
                 <w:strike w:val="false"/>
                 <w:color w:val="000000"/>
               </w:rPr>
-              <w:t xml:space="preserve">54 (27)</w:t>
-            </w:r>
-          </w:p>
-        </w:tc>
-        <w:tc>
-          <w:tcPr>
-            <w:tcBorders>
-              <w:bottom w:val="single" w:sz="4" w:space="0" w:color="000000"/>
-              <w:top w:val="single" w:sz="4" w:space="0" w:color="000000"/>
-              <w:left w:val="single" w:sz="4" w:space="0" w:color="000000"/>
-              <w:right w:val="single" w:sz="4" w:space="0" w:color="000000"/>
-            </w:tcBorders>
-            <w:shd w:val="clear" w:color="auto" w:fill="FFFFFF"/>
-            <w:tcMar>
-              <w:top w:w="0" w:type="dxa"/>
-              <w:bottom w:w="0" w:type="dxa"/>
-              <w:left w:w="0" w:type="dxa"/>
-              <w:right w:w="0" w:type="dxa"/>
-            </w:tcMar>
-            <w:vAlign w:val="center"/>
-          </w:tcPr>
-          <w:p>
-            <w:pPr>
-              <w:pStyle w:val="Normal"/>
-              <w:jc w:val="center"/>
-              <w:pBdr>
-                <w:bottom w:val="none" w:sz="0" w:space="0" w:color="000000"/>
-                <w:top w:val="none" w:sz="0" w:space="0" w:color="000000"/>
-                <w:left w:val="none" w:sz="0" w:space="0" w:color="000000"/>
-                <w:right w:val="none" w:sz="0" w:space="0" w:color="000000"/>
-              </w:pBdr>
-              <w:spacing w:after="100" w:before="100" w:line="240"/>
-              <w:ind w:left="100" w:right="100" w:firstLine="0" w:firstLineChars="0"/>
-              <w:rPr>
-                <w:rFonts/>
-                <w:i w:val="false"/>
-                <w:b w:val="false"/>
-                <w:u w:val="none"/>
-                <w:strike w:val="false"/>
-                <w:color w:val="000000"/>
-              </w:rPr>
-            </w:pPr>
-            <w:r>
-              <w:rPr>
-                <w:rFonts/>
-                <w:i w:val="false"/>
-                <w:b w:val="false"/>
-                <w:u w:val="none"/>
-                <w:strike w:val="false"/>
-                <w:color w:val="000000"/>
-              </w:rPr>
-              <w:t xml:space="preserve">25 (26)</w:t>
-            </w:r>
-          </w:p>
-        </w:tc>
-        <w:tc>
-          <w:tcPr>
-            <w:tcBorders>
-              <w:bottom w:val="single" w:sz="4" w:space="0" w:color="000000"/>
-              <w:top w:val="single" w:sz="4" w:space="0" w:color="000000"/>
-              <w:left w:val="single" w:sz="4" w:space="0" w:color="000000"/>
-              <w:right w:val="single" w:sz="4" w:space="0" w:color="000000"/>
-            </w:tcBorders>
-            <w:shd w:val="clear" w:color="auto" w:fill="FFFFFF"/>
-            <w:tcMar>
-              <w:top w:w="0" w:type="dxa"/>
-              <w:bottom w:w="0" w:type="dxa"/>
-              <w:left w:w="0" w:type="dxa"/>
-              <w:right w:w="0" w:type="dxa"/>
-            </w:tcMar>
-            <w:vAlign w:val="center"/>
-          </w:tcPr>
-          <w:p>
-            <w:pPr>
-              <w:pStyle w:val="Normal"/>
-              <w:jc w:val="center"/>
-              <w:pBdr>
-                <w:bottom w:val="none" w:sz="0" w:space="0" w:color="000000"/>
-                <w:top w:val="none" w:sz="0" w:space="0" w:color="000000"/>
-                <w:left w:val="none" w:sz="0" w:space="0" w:color="000000"/>
-                <w:right w:val="none" w:sz="0" w:space="0" w:color="000000"/>
-              </w:pBdr>
-              <w:spacing w:after="100" w:before="100" w:line="240"/>
-              <w:ind w:left="100" w:right="100" w:firstLine="0" w:firstLineChars="0"/>
-              <w:rPr>
-                <w:rFonts/>
-                <w:i w:val="false"/>
-                <w:b w:val="false"/>
-                <w:u w:val="none"/>
-                <w:strike w:val="false"/>
-                <w:color w:val="000000"/>
-              </w:rPr>
-            </w:pPr>
-            <w:r>
-              <w:rPr>
-                <w:rFonts/>
-                <w:i w:val="false"/>
-                <w:b w:val="false"/>
-                <w:u w:val="none"/>
-                <w:strike w:val="false"/>
-                <w:color w:val="000000"/>
-              </w:rPr>
-              <w:t xml:space="preserve">29 (28)</w:t>
+              <w:t xml:space="preserve">54(27)</w:t>
+            </w:r>
+          </w:p>
+        </w:tc>
+        <w:tc>
+          <w:tcPr>
+            <w:tcBorders>
+              <w:bottom w:val="single" w:sz="4" w:space="0" w:color="000000"/>
+              <w:top w:val="single" w:sz="4" w:space="0" w:color="000000"/>
+              <w:left w:val="single" w:sz="4" w:space="0" w:color="000000"/>
+              <w:right w:val="single" w:sz="4" w:space="0" w:color="000000"/>
+            </w:tcBorders>
+            <w:shd w:val="clear" w:color="auto" w:fill="FFFFFF"/>
+            <w:tcMar>
+              <w:top w:w="0" w:type="dxa"/>
+              <w:bottom w:w="0" w:type="dxa"/>
+              <w:left w:w="0" w:type="dxa"/>
+              <w:right w:w="0" w:type="dxa"/>
+            </w:tcMar>
+            <w:vAlign w:val="center"/>
+          </w:tcPr>
+          <w:p>
+            <w:pPr>
+              <w:pStyle w:val="Normal"/>
+              <w:jc w:val="center"/>
+              <w:pBdr>
+                <w:bottom w:val="none" w:sz="0" w:space="0" w:color="000000"/>
+                <w:top w:val="none" w:sz="0" w:space="0" w:color="000000"/>
+                <w:left w:val="none" w:sz="0" w:space="0" w:color="000000"/>
+                <w:right w:val="none" w:sz="0" w:space="0" w:color="000000"/>
+              </w:pBdr>
+              <w:spacing w:after="100" w:before="100" w:line="240"/>
+              <w:ind w:left="100" w:right="100" w:firstLine="0" w:firstLineChars="0"/>
+              <w:rPr>
+                <w:rFonts/>
+                <w:i w:val="false"/>
+                <w:b w:val="false"/>
+                <w:u w:val="none"/>
+                <w:strike w:val="false"/>
+                <w:color w:val="000000"/>
+              </w:rPr>
+            </w:pPr>
+            <w:r>
+              <w:rPr>
+                <w:rFonts/>
+                <w:i w:val="false"/>
+                <w:b w:val="false"/>
+                <w:u w:val="none"/>
+                <w:strike w:val="false"/>
+                <w:color w:val="000000"/>
+              </w:rPr>
+              <w:t xml:space="preserve">25(26)</w:t>
+            </w:r>
+          </w:p>
+        </w:tc>
+        <w:tc>
+          <w:tcPr>
+            <w:tcBorders>
+              <w:bottom w:val="single" w:sz="4" w:space="0" w:color="000000"/>
+              <w:top w:val="single" w:sz="4" w:space="0" w:color="000000"/>
+              <w:left w:val="single" w:sz="4" w:space="0" w:color="000000"/>
+              <w:right w:val="single" w:sz="4" w:space="0" w:color="000000"/>
+            </w:tcBorders>
+            <w:shd w:val="clear" w:color="auto" w:fill="FFFFFF"/>
+            <w:tcMar>
+              <w:top w:w="0" w:type="dxa"/>
+              <w:bottom w:w="0" w:type="dxa"/>
+              <w:left w:w="0" w:type="dxa"/>
+              <w:right w:w="0" w:type="dxa"/>
+            </w:tcMar>
+            <w:vAlign w:val="center"/>
+          </w:tcPr>
+          <w:p>
+            <w:pPr>
+              <w:pStyle w:val="Normal"/>
+              <w:jc w:val="center"/>
+              <w:pBdr>
+                <w:bottom w:val="none" w:sz="0" w:space="0" w:color="000000"/>
+                <w:top w:val="none" w:sz="0" w:space="0" w:color="000000"/>
+                <w:left w:val="none" w:sz="0" w:space="0" w:color="000000"/>
+                <w:right w:val="none" w:sz="0" w:space="0" w:color="000000"/>
+              </w:pBdr>
+              <w:spacing w:after="100" w:before="100" w:line="240"/>
+              <w:ind w:left="100" w:right="100" w:firstLine="0" w:firstLineChars="0"/>
+              <w:rPr>
+                <w:rFonts/>
+                <w:i w:val="false"/>
+                <w:b w:val="false"/>
+                <w:u w:val="none"/>
+                <w:strike w:val="false"/>
+                <w:color w:val="000000"/>
+              </w:rPr>
+            </w:pPr>
+            <w:r>
+              <w:rPr>
+                <w:rFonts/>
+                <w:i w:val="false"/>
+                <w:b w:val="false"/>
+                <w:u w:val="none"/>
+                <w:strike w:val="false"/>
+                <w:color w:val="000000"/>
+              </w:rPr>
+              <w:t xml:space="preserve">29(28)</w:t>
             </w:r>
           </w:p>
         </w:tc>
@@ -2471,109 +2471,109 @@
                 <w:strike w:val="false"/>
                 <w:color w:val="000000"/>
               </w:rPr>
-              <w:t xml:space="preserve">43 (22)</w:t>
-            </w:r>
-          </w:p>
-        </w:tc>
-        <w:tc>
-          <w:tcPr>
-            <w:tcBorders>
-              <w:bottom w:val="single" w:sz="4" w:space="0" w:color="000000"/>
-              <w:top w:val="single" w:sz="4" w:space="0" w:color="000000"/>
-              <w:left w:val="single" w:sz="4" w:space="0" w:color="000000"/>
-              <w:right w:val="single" w:sz="4" w:space="0" w:color="000000"/>
-            </w:tcBorders>
-            <w:shd w:val="clear" w:color="auto" w:fill="FFFFFF"/>
-            <w:tcMar>
-              <w:top w:w="0" w:type="dxa"/>
-              <w:bottom w:w="0" w:type="dxa"/>
-              <w:left w:w="0" w:type="dxa"/>
-              <w:right w:w="0" w:type="dxa"/>
-            </w:tcMar>
-            <w:vAlign w:val="center"/>
-          </w:tcPr>
-          <w:p>
-            <w:pPr>
-              <w:pStyle w:val="Normal"/>
-              <w:jc w:val="center"/>
-              <w:pBdr>
-                <w:bottom w:val="none" w:sz="0" w:space="0" w:color="000000"/>
-                <w:top w:val="none" w:sz="0" w:space="0" w:color="000000"/>
-                <w:left w:val="none" w:sz="0" w:space="0" w:color="000000"/>
-                <w:right w:val="none" w:sz="0" w:space="0" w:color="000000"/>
-              </w:pBdr>
-              <w:spacing w:after="100" w:before="100" w:line="240"/>
-              <w:ind w:left="100" w:right="100" w:firstLine="0" w:firstLineChars="0"/>
-              <w:rPr>
-                <w:rFonts/>
-                <w:i w:val="false"/>
-                <w:b w:val="false"/>
-                <w:u w:val="none"/>
-                <w:strike w:val="false"/>
-                <w:color w:val="000000"/>
-              </w:rPr>
-            </w:pPr>
-            <w:r>
-              <w:rPr>
-                <w:rFonts/>
-                <w:i w:val="false"/>
-                <w:b w:val="false"/>
-                <w:u w:val="none"/>
-                <w:strike w:val="false"/>
-                <w:color w:val="000000"/>
-              </w:rPr>
-              <w:t xml:space="preserve">22 (22)</w:t>
-            </w:r>
-          </w:p>
-        </w:tc>
-        <w:tc>
-          <w:tcPr>
-            <w:tcBorders>
-              <w:bottom w:val="single" w:sz="4" w:space="0" w:color="000000"/>
-              <w:top w:val="single" w:sz="4" w:space="0" w:color="000000"/>
-              <w:left w:val="single" w:sz="4" w:space="0" w:color="000000"/>
-              <w:right w:val="single" w:sz="4" w:space="0" w:color="000000"/>
-            </w:tcBorders>
-            <w:shd w:val="clear" w:color="auto" w:fill="FFFFFF"/>
-            <w:tcMar>
-              <w:top w:w="0" w:type="dxa"/>
-              <w:bottom w:w="0" w:type="dxa"/>
-              <w:left w:w="0" w:type="dxa"/>
-              <w:right w:w="0" w:type="dxa"/>
-            </w:tcMar>
-            <w:vAlign w:val="center"/>
-          </w:tcPr>
-          <w:p>
-            <w:pPr>
-              <w:pStyle w:val="Normal"/>
-              <w:jc w:val="center"/>
-              <w:pBdr>
-                <w:bottom w:val="none" w:sz="0" w:space="0" w:color="000000"/>
-                <w:top w:val="none" w:sz="0" w:space="0" w:color="000000"/>
-                <w:left w:val="none" w:sz="0" w:space="0" w:color="000000"/>
-                <w:right w:val="none" w:sz="0" w:space="0" w:color="000000"/>
-              </w:pBdr>
-              <w:spacing w:after="100" w:before="100" w:line="240"/>
-              <w:ind w:left="100" w:right="100" w:firstLine="0" w:firstLineChars="0"/>
-              <w:rPr>
-                <w:rFonts/>
-                <w:i w:val="false"/>
-                <w:b w:val="false"/>
-                <w:u w:val="none"/>
-                <w:strike w:val="false"/>
-                <w:color w:val="000000"/>
-              </w:rPr>
-            </w:pPr>
-            <w:r>
-              <w:rPr>
-                <w:rFonts/>
-                <w:i w:val="false"/>
-                <w:b w:val="false"/>
-                <w:u w:val="none"/>
-                <w:strike w:val="false"/>
-                <w:color w:val="000000"/>
-              </w:rPr>
-              <w:t xml:space="preserve">21 (21)</w:t>
+              <w:t xml:space="preserve">43(22)</w:t>
+            </w:r>
+          </w:p>
+        </w:tc>
+        <w:tc>
+          <w:tcPr>
+            <w:tcBorders>
+              <w:bottom w:val="single" w:sz="4" w:space="0" w:color="000000"/>
+              <w:top w:val="single" w:sz="4" w:space="0" w:color="000000"/>
+              <w:left w:val="single" w:sz="4" w:space="0" w:color="000000"/>
+              <w:right w:val="single" w:sz="4" w:space="0" w:color="000000"/>
+            </w:tcBorders>
+            <w:shd w:val="clear" w:color="auto" w:fill="FFFFFF"/>
+            <w:tcMar>
+              <w:top w:w="0" w:type="dxa"/>
+              <w:bottom w:w="0" w:type="dxa"/>
+              <w:left w:w="0" w:type="dxa"/>
+              <w:right w:w="0" w:type="dxa"/>
+            </w:tcMar>
+            <w:vAlign w:val="center"/>
+          </w:tcPr>
+          <w:p>
+            <w:pPr>
+              <w:pStyle w:val="Normal"/>
+              <w:jc w:val="center"/>
+              <w:pBdr>
+                <w:bottom w:val="none" w:sz="0" w:space="0" w:color="000000"/>
+                <w:top w:val="none" w:sz="0" w:space="0" w:color="000000"/>
+                <w:left w:val="none" w:sz="0" w:space="0" w:color="000000"/>
+                <w:right w:val="none" w:sz="0" w:space="0" w:color="000000"/>
+              </w:pBdr>
+              <w:spacing w:after="100" w:before="100" w:line="240"/>
+              <w:ind w:left="100" w:right="100" w:firstLine="0" w:firstLineChars="0"/>
+              <w:rPr>
+                <w:rFonts/>
+                <w:i w:val="false"/>
+                <w:b w:val="false"/>
+                <w:u w:val="none"/>
+                <w:strike w:val="false"/>
+                <w:color w:val="000000"/>
+              </w:rPr>
+            </w:pPr>
+            <w:r>
+              <w:rPr>
+                <w:rFonts/>
+                <w:i w:val="false"/>
+                <w:b w:val="false"/>
+                <w:u w:val="none"/>
+                <w:strike w:val="false"/>
+                <w:color w:val="000000"/>
+              </w:rPr>
+              <w:t xml:space="preserve">22(22)</w:t>
+            </w:r>
+          </w:p>
+        </w:tc>
+        <w:tc>
+          <w:tcPr>
+            <w:tcBorders>
+              <w:bottom w:val="single" w:sz="4" w:space="0" w:color="000000"/>
+              <w:top w:val="single" w:sz="4" w:space="0" w:color="000000"/>
+              <w:left w:val="single" w:sz="4" w:space="0" w:color="000000"/>
+              <w:right w:val="single" w:sz="4" w:space="0" w:color="000000"/>
+            </w:tcBorders>
+            <w:shd w:val="clear" w:color="auto" w:fill="FFFFFF"/>
+            <w:tcMar>
+              <w:top w:w="0" w:type="dxa"/>
+              <w:bottom w:w="0" w:type="dxa"/>
+              <w:left w:w="0" w:type="dxa"/>
+              <w:right w:w="0" w:type="dxa"/>
+            </w:tcMar>
+            <w:vAlign w:val="center"/>
+          </w:tcPr>
+          <w:p>
+            <w:pPr>
+              <w:pStyle w:val="Normal"/>
+              <w:jc w:val="center"/>
+              <w:pBdr>
+                <w:bottom w:val="none" w:sz="0" w:space="0" w:color="000000"/>
+                <w:top w:val="none" w:sz="0" w:space="0" w:color="000000"/>
+                <w:left w:val="none" w:sz="0" w:space="0" w:color="000000"/>
+                <w:right w:val="none" w:sz="0" w:space="0" w:color="000000"/>
+              </w:pBdr>
+              <w:spacing w:after="100" w:before="100" w:line="240"/>
+              <w:ind w:left="100" w:right="100" w:firstLine="0" w:firstLineChars="0"/>
+              <w:rPr>
+                <w:rFonts/>
+                <w:i w:val="false"/>
+                <w:b w:val="false"/>
+                <w:u w:val="none"/>
+                <w:strike w:val="false"/>
+                <w:color w:val="000000"/>
+              </w:rPr>
+            </w:pPr>
+            <w:r>
+              <w:rPr>
+                <w:rFonts/>
+                <w:i w:val="false"/>
+                <w:b w:val="false"/>
+                <w:u w:val="none"/>
+                <w:strike w:val="false"/>
+                <w:color w:val="000000"/>
+              </w:rPr>
+              <w:t xml:space="preserve">21(21)</w:t>
             </w:r>
           </w:p>
         </w:tc>
@@ -2783,109 +2783,109 @@
                 <w:strike w:val="false"/>
                 <w:color w:val="000000"/>
               </w:rPr>
-              <w:t xml:space="preserve">50 (25)</w:t>
-            </w:r>
-          </w:p>
-        </w:tc>
-        <w:tc>
-          <w:tcPr>
-            <w:tcBorders>
-              <w:bottom w:val="single" w:sz="4" w:space="0" w:color="000000"/>
-              <w:top w:val="single" w:sz="4" w:space="0" w:color="000000"/>
-              <w:left w:val="single" w:sz="4" w:space="0" w:color="000000"/>
-              <w:right w:val="single" w:sz="4" w:space="0" w:color="000000"/>
-            </w:tcBorders>
-            <w:shd w:val="clear" w:color="auto" w:fill="FFFFFF"/>
-            <w:tcMar>
-              <w:top w:w="0" w:type="dxa"/>
-              <w:bottom w:w="0" w:type="dxa"/>
-              <w:left w:w="0" w:type="dxa"/>
-              <w:right w:w="0" w:type="dxa"/>
-            </w:tcMar>
-            <w:vAlign w:val="center"/>
-          </w:tcPr>
-          <w:p>
-            <w:pPr>
-              <w:pStyle w:val="Normal"/>
-              <w:jc w:val="center"/>
-              <w:pBdr>
-                <w:bottom w:val="none" w:sz="0" w:space="0" w:color="000000"/>
-                <w:top w:val="none" w:sz="0" w:space="0" w:color="000000"/>
-                <w:left w:val="none" w:sz="0" w:space="0" w:color="000000"/>
-                <w:right w:val="none" w:sz="0" w:space="0" w:color="000000"/>
-              </w:pBdr>
-              <w:spacing w:after="100" w:before="100" w:line="240"/>
-              <w:ind w:left="100" w:right="100" w:firstLine="0" w:firstLineChars="0"/>
-              <w:rPr>
-                <w:rFonts/>
-                <w:i w:val="false"/>
-                <w:b w:val="false"/>
-                <w:u w:val="none"/>
-                <w:strike w:val="false"/>
-                <w:color w:val="000000"/>
-              </w:rPr>
-            </w:pPr>
-            <w:r>
-              <w:rPr>
-                <w:rFonts/>
-                <w:i w:val="false"/>
-                <w:b w:val="false"/>
-                <w:u w:val="none"/>
-                <w:strike w:val="false"/>
-                <w:color w:val="000000"/>
-              </w:rPr>
-              <w:t xml:space="preserve">23 (23)</w:t>
-            </w:r>
-          </w:p>
-        </w:tc>
-        <w:tc>
-          <w:tcPr>
-            <w:tcBorders>
-              <w:bottom w:val="single" w:sz="4" w:space="0" w:color="000000"/>
-              <w:top w:val="single" w:sz="4" w:space="0" w:color="000000"/>
-              <w:left w:val="single" w:sz="4" w:space="0" w:color="000000"/>
-              <w:right w:val="single" w:sz="4" w:space="0" w:color="000000"/>
-            </w:tcBorders>
-            <w:shd w:val="clear" w:color="auto" w:fill="FFFFFF"/>
-            <w:tcMar>
-              <w:top w:w="0" w:type="dxa"/>
-              <w:bottom w:w="0" w:type="dxa"/>
-              <w:left w:w="0" w:type="dxa"/>
-              <w:right w:w="0" w:type="dxa"/>
-            </w:tcMar>
-            <w:vAlign w:val="center"/>
-          </w:tcPr>
-          <w:p>
-            <w:pPr>
-              <w:pStyle w:val="Normal"/>
-              <w:jc w:val="center"/>
-              <w:pBdr>
-                <w:bottom w:val="none" w:sz="0" w:space="0" w:color="000000"/>
-                <w:top w:val="none" w:sz="0" w:space="0" w:color="000000"/>
-                <w:left w:val="none" w:sz="0" w:space="0" w:color="000000"/>
-                <w:right w:val="none" w:sz="0" w:space="0" w:color="000000"/>
-              </w:pBdr>
-              <w:spacing w:after="100" w:before="100" w:line="240"/>
-              <w:ind w:left="100" w:right="100" w:firstLine="0" w:firstLineChars="0"/>
-              <w:rPr>
-                <w:rFonts/>
-                <w:i w:val="false"/>
-                <w:b w:val="false"/>
-                <w:u w:val="none"/>
-                <w:strike w:val="false"/>
-                <w:color w:val="000000"/>
-              </w:rPr>
-            </w:pPr>
-            <w:r>
-              <w:rPr>
-                <w:rFonts/>
-                <w:i w:val="false"/>
-                <w:b w:val="false"/>
-                <w:u w:val="none"/>
-                <w:strike w:val="false"/>
-                <w:color w:val="000000"/>
-              </w:rPr>
-              <w:t xml:space="preserve">27 (26)</w:t>
+              <w:t xml:space="preserve">50(25)</w:t>
+            </w:r>
+          </w:p>
+        </w:tc>
+        <w:tc>
+          <w:tcPr>
+            <w:tcBorders>
+              <w:bottom w:val="single" w:sz="4" w:space="0" w:color="000000"/>
+              <w:top w:val="single" w:sz="4" w:space="0" w:color="000000"/>
+              <w:left w:val="single" w:sz="4" w:space="0" w:color="000000"/>
+              <w:right w:val="single" w:sz="4" w:space="0" w:color="000000"/>
+            </w:tcBorders>
+            <w:shd w:val="clear" w:color="auto" w:fill="FFFFFF"/>
+            <w:tcMar>
+              <w:top w:w="0" w:type="dxa"/>
+              <w:bottom w:w="0" w:type="dxa"/>
+              <w:left w:w="0" w:type="dxa"/>
+              <w:right w:w="0" w:type="dxa"/>
+            </w:tcMar>
+            <w:vAlign w:val="center"/>
+          </w:tcPr>
+          <w:p>
+            <w:pPr>
+              <w:pStyle w:val="Normal"/>
+              <w:jc w:val="center"/>
+              <w:pBdr>
+                <w:bottom w:val="none" w:sz="0" w:space="0" w:color="000000"/>
+                <w:top w:val="none" w:sz="0" w:space="0" w:color="000000"/>
+                <w:left w:val="none" w:sz="0" w:space="0" w:color="000000"/>
+                <w:right w:val="none" w:sz="0" w:space="0" w:color="000000"/>
+              </w:pBdr>
+              <w:spacing w:after="100" w:before="100" w:line="240"/>
+              <w:ind w:left="100" w:right="100" w:firstLine="0" w:firstLineChars="0"/>
+              <w:rPr>
+                <w:rFonts/>
+                <w:i w:val="false"/>
+                <w:b w:val="false"/>
+                <w:u w:val="none"/>
+                <w:strike w:val="false"/>
+                <w:color w:val="000000"/>
+              </w:rPr>
+            </w:pPr>
+            <w:r>
+              <w:rPr>
+                <w:rFonts/>
+                <w:i w:val="false"/>
+                <w:b w:val="false"/>
+                <w:u w:val="none"/>
+                <w:strike w:val="false"/>
+                <w:color w:val="000000"/>
+              </w:rPr>
+              <w:t xml:space="preserve">23(23)</w:t>
+            </w:r>
+          </w:p>
+        </w:tc>
+        <w:tc>
+          <w:tcPr>
+            <w:tcBorders>
+              <w:bottom w:val="single" w:sz="4" w:space="0" w:color="000000"/>
+              <w:top w:val="single" w:sz="4" w:space="0" w:color="000000"/>
+              <w:left w:val="single" w:sz="4" w:space="0" w:color="000000"/>
+              <w:right w:val="single" w:sz="4" w:space="0" w:color="000000"/>
+            </w:tcBorders>
+            <w:shd w:val="clear" w:color="auto" w:fill="FFFFFF"/>
+            <w:tcMar>
+              <w:top w:w="0" w:type="dxa"/>
+              <w:bottom w:w="0" w:type="dxa"/>
+              <w:left w:w="0" w:type="dxa"/>
+              <w:right w:w="0" w:type="dxa"/>
+            </w:tcMar>
+            <w:vAlign w:val="center"/>
+          </w:tcPr>
+          <w:p>
+            <w:pPr>
+              <w:pStyle w:val="Normal"/>
+              <w:jc w:val="center"/>
+              <w:pBdr>
+                <w:bottom w:val="none" w:sz="0" w:space="0" w:color="000000"/>
+                <w:top w:val="none" w:sz="0" w:space="0" w:color="000000"/>
+                <w:left w:val="none" w:sz="0" w:space="0" w:color="000000"/>
+                <w:right w:val="none" w:sz="0" w:space="0" w:color="000000"/>
+              </w:pBdr>
+              <w:spacing w:after="100" w:before="100" w:line="240"/>
+              <w:ind w:left="100" w:right="100" w:firstLine="0" w:firstLineChars="0"/>
+              <w:rPr>
+                <w:rFonts/>
+                <w:i w:val="false"/>
+                <w:b w:val="false"/>
+                <w:u w:val="none"/>
+                <w:strike w:val="false"/>
+                <w:color w:val="000000"/>
+              </w:rPr>
+            </w:pPr>
+            <w:r>
+              <w:rPr>
+                <w:rFonts/>
+                <w:i w:val="false"/>
+                <w:b w:val="false"/>
+                <w:u w:val="none"/>
+                <w:strike w:val="false"/>
+                <w:color w:val="000000"/>
+              </w:rPr>
+              <w:t xml:space="preserve">27(26)</w:t>
             </w:r>
           </w:p>
         </w:tc>
@@ -3407,109 +3407,109 @@
                 <w:strike w:val="false"/>
                 <w:color w:val="000000"/>
               </w:rPr>
-              <w:t xml:space="preserve">68 (34)</w:t>
-            </w:r>
-          </w:p>
-        </w:tc>
-        <w:tc>
-          <w:tcPr>
-            <w:tcBorders>
-              <w:bottom w:val="single" w:sz="4" w:space="0" w:color="000000"/>
-              <w:top w:val="single" w:sz="4" w:space="0" w:color="000000"/>
-              <w:left w:val="single" w:sz="4" w:space="0" w:color="000000"/>
-              <w:right w:val="single" w:sz="4" w:space="0" w:color="000000"/>
-            </w:tcBorders>
-            <w:shd w:val="clear" w:color="auto" w:fill="FFFFFF"/>
-            <w:tcMar>
-              <w:top w:w="0" w:type="dxa"/>
-              <w:bottom w:w="0" w:type="dxa"/>
-              <w:left w:w="0" w:type="dxa"/>
-              <w:right w:w="0" w:type="dxa"/>
-            </w:tcMar>
-            <w:vAlign w:val="center"/>
-          </w:tcPr>
-          <w:p>
-            <w:pPr>
-              <w:pStyle w:val="Normal"/>
-              <w:jc w:val="center"/>
-              <w:pBdr>
-                <w:bottom w:val="none" w:sz="0" w:space="0" w:color="000000"/>
-                <w:top w:val="none" w:sz="0" w:space="0" w:color="000000"/>
-                <w:left w:val="none" w:sz="0" w:space="0" w:color="000000"/>
-                <w:right w:val="none" w:sz="0" w:space="0" w:color="000000"/>
-              </w:pBdr>
-              <w:spacing w:after="100" w:before="100" w:line="240"/>
-              <w:ind w:left="100" w:right="100" w:firstLine="0" w:firstLineChars="0"/>
-              <w:rPr>
-                <w:rFonts/>
-                <w:i w:val="false"/>
-                <w:b w:val="false"/>
-                <w:u w:val="none"/>
-                <w:strike w:val="false"/>
-                <w:color w:val="000000"/>
-              </w:rPr>
-            </w:pPr>
-            <w:r>
-              <w:rPr>
-                <w:rFonts/>
-                <w:i w:val="false"/>
-                <w:b w:val="false"/>
-                <w:u w:val="none"/>
-                <w:strike w:val="false"/>
-                <w:color w:val="000000"/>
-              </w:rPr>
-              <w:t xml:space="preserve">35 (36)</w:t>
-            </w:r>
-          </w:p>
-        </w:tc>
-        <w:tc>
-          <w:tcPr>
-            <w:tcBorders>
-              <w:bottom w:val="single" w:sz="4" w:space="0" w:color="000000"/>
-              <w:top w:val="single" w:sz="4" w:space="0" w:color="000000"/>
-              <w:left w:val="single" w:sz="4" w:space="0" w:color="000000"/>
-              <w:right w:val="single" w:sz="4" w:space="0" w:color="000000"/>
-            </w:tcBorders>
-            <w:shd w:val="clear" w:color="auto" w:fill="FFFFFF"/>
-            <w:tcMar>
-              <w:top w:w="0" w:type="dxa"/>
-              <w:bottom w:w="0" w:type="dxa"/>
-              <w:left w:w="0" w:type="dxa"/>
-              <w:right w:w="0" w:type="dxa"/>
-            </w:tcMar>
-            <w:vAlign w:val="center"/>
-          </w:tcPr>
-          <w:p>
-            <w:pPr>
-              <w:pStyle w:val="Normal"/>
-              <w:jc w:val="center"/>
-              <w:pBdr>
-                <w:bottom w:val="none" w:sz="0" w:space="0" w:color="000000"/>
-                <w:top w:val="none" w:sz="0" w:space="0" w:color="000000"/>
-                <w:left w:val="none" w:sz="0" w:space="0" w:color="000000"/>
-                <w:right w:val="none" w:sz="0" w:space="0" w:color="000000"/>
-              </w:pBdr>
-              <w:spacing w:after="100" w:before="100" w:line="240"/>
-              <w:ind w:left="100" w:right="100" w:firstLine="0" w:firstLineChars="0"/>
-              <w:rPr>
-                <w:rFonts/>
-                <w:i w:val="false"/>
-                <w:b w:val="false"/>
-                <w:u w:val="none"/>
-                <w:strike w:val="false"/>
-                <w:color w:val="000000"/>
-              </w:rPr>
-            </w:pPr>
-            <w:r>
-              <w:rPr>
-                <w:rFonts/>
-                <w:i w:val="false"/>
-                <w:b w:val="false"/>
-                <w:u w:val="none"/>
-                <w:strike w:val="false"/>
-                <w:color w:val="000000"/>
-              </w:rPr>
-              <w:t xml:space="preserve">33 (32)</w:t>
+              <w:t xml:space="preserve">68(34)</w:t>
+            </w:r>
+          </w:p>
+        </w:tc>
+        <w:tc>
+          <w:tcPr>
+            <w:tcBorders>
+              <w:bottom w:val="single" w:sz="4" w:space="0" w:color="000000"/>
+              <w:top w:val="single" w:sz="4" w:space="0" w:color="000000"/>
+              <w:left w:val="single" w:sz="4" w:space="0" w:color="000000"/>
+              <w:right w:val="single" w:sz="4" w:space="0" w:color="000000"/>
+            </w:tcBorders>
+            <w:shd w:val="clear" w:color="auto" w:fill="FFFFFF"/>
+            <w:tcMar>
+              <w:top w:w="0" w:type="dxa"/>
+              <w:bottom w:w="0" w:type="dxa"/>
+              <w:left w:w="0" w:type="dxa"/>
+              <w:right w:w="0" w:type="dxa"/>
+            </w:tcMar>
+            <w:vAlign w:val="center"/>
+          </w:tcPr>
+          <w:p>
+            <w:pPr>
+              <w:pStyle w:val="Normal"/>
+              <w:jc w:val="center"/>
+              <w:pBdr>
+                <w:bottom w:val="none" w:sz="0" w:space="0" w:color="000000"/>
+                <w:top w:val="none" w:sz="0" w:space="0" w:color="000000"/>
+                <w:left w:val="none" w:sz="0" w:space="0" w:color="000000"/>
+                <w:right w:val="none" w:sz="0" w:space="0" w:color="000000"/>
+              </w:pBdr>
+              <w:spacing w:after="100" w:before="100" w:line="240"/>
+              <w:ind w:left="100" w:right="100" w:firstLine="0" w:firstLineChars="0"/>
+              <w:rPr>
+                <w:rFonts/>
+                <w:i w:val="false"/>
+                <w:b w:val="false"/>
+                <w:u w:val="none"/>
+                <w:strike w:val="false"/>
+                <w:color w:val="000000"/>
+              </w:rPr>
+            </w:pPr>
+            <w:r>
+              <w:rPr>
+                <w:rFonts/>
+                <w:i w:val="false"/>
+                <w:b w:val="false"/>
+                <w:u w:val="none"/>
+                <w:strike w:val="false"/>
+                <w:color w:val="000000"/>
+              </w:rPr>
+              <w:t xml:space="preserve">35(36)</w:t>
+            </w:r>
+          </w:p>
+        </w:tc>
+        <w:tc>
+          <w:tcPr>
+            <w:tcBorders>
+              <w:bottom w:val="single" w:sz="4" w:space="0" w:color="000000"/>
+              <w:top w:val="single" w:sz="4" w:space="0" w:color="000000"/>
+              <w:left w:val="single" w:sz="4" w:space="0" w:color="000000"/>
+              <w:right w:val="single" w:sz="4" w:space="0" w:color="000000"/>
+            </w:tcBorders>
+            <w:shd w:val="clear" w:color="auto" w:fill="FFFFFF"/>
+            <w:tcMar>
+              <w:top w:w="0" w:type="dxa"/>
+              <w:bottom w:w="0" w:type="dxa"/>
+              <w:left w:w="0" w:type="dxa"/>
+              <w:right w:w="0" w:type="dxa"/>
+            </w:tcMar>
+            <w:vAlign w:val="center"/>
+          </w:tcPr>
+          <w:p>
+            <w:pPr>
+              <w:pStyle w:val="Normal"/>
+              <w:jc w:val="center"/>
+              <w:pBdr>
+                <w:bottom w:val="none" w:sz="0" w:space="0" w:color="000000"/>
+                <w:top w:val="none" w:sz="0" w:space="0" w:color="000000"/>
+                <w:left w:val="none" w:sz="0" w:space="0" w:color="000000"/>
+                <w:right w:val="none" w:sz="0" w:space="0" w:color="000000"/>
+              </w:pBdr>
+              <w:spacing w:after="100" w:before="100" w:line="240"/>
+              <w:ind w:left="100" w:right="100" w:firstLine="0" w:firstLineChars="0"/>
+              <w:rPr>
+                <w:rFonts/>
+                <w:i w:val="false"/>
+                <w:b w:val="false"/>
+                <w:u w:val="none"/>
+                <w:strike w:val="false"/>
+                <w:color w:val="000000"/>
+              </w:rPr>
+            </w:pPr>
+            <w:r>
+              <w:rPr>
+                <w:rFonts/>
+                <w:i w:val="false"/>
+                <w:b w:val="false"/>
+                <w:u w:val="none"/>
+                <w:strike w:val="false"/>
+                <w:color w:val="000000"/>
+              </w:rPr>
+              <w:t xml:space="preserve">33(32)</w:t>
             </w:r>
           </w:p>
         </w:tc>
@@ -3719,109 +3719,109 @@
                 <w:strike w:val="false"/>
                 <w:color w:val="000000"/>
               </w:rPr>
-              <w:t xml:space="preserve">68 (34)</w:t>
-            </w:r>
-          </w:p>
-        </w:tc>
-        <w:tc>
-          <w:tcPr>
-            <w:tcBorders>
-              <w:bottom w:val="single" w:sz="4" w:space="0" w:color="000000"/>
-              <w:top w:val="single" w:sz="4" w:space="0" w:color="000000"/>
-              <w:left w:val="single" w:sz="4" w:space="0" w:color="000000"/>
-              <w:right w:val="single" w:sz="4" w:space="0" w:color="000000"/>
-            </w:tcBorders>
-            <w:shd w:val="clear" w:color="auto" w:fill="FFFFFF"/>
-            <w:tcMar>
-              <w:top w:w="0" w:type="dxa"/>
-              <w:bottom w:w="0" w:type="dxa"/>
-              <w:left w:w="0" w:type="dxa"/>
-              <w:right w:w="0" w:type="dxa"/>
-            </w:tcMar>
-            <w:vAlign w:val="center"/>
-          </w:tcPr>
-          <w:p>
-            <w:pPr>
-              <w:pStyle w:val="Normal"/>
-              <w:jc w:val="center"/>
-              <w:pBdr>
-                <w:bottom w:val="none" w:sz="0" w:space="0" w:color="000000"/>
-                <w:top w:val="none" w:sz="0" w:space="0" w:color="000000"/>
-                <w:left w:val="none" w:sz="0" w:space="0" w:color="000000"/>
-                <w:right w:val="none" w:sz="0" w:space="0" w:color="000000"/>
-              </w:pBdr>
-              <w:spacing w:after="100" w:before="100" w:line="240"/>
-              <w:ind w:left="100" w:right="100" w:firstLine="0" w:firstLineChars="0"/>
-              <w:rPr>
-                <w:rFonts/>
-                <w:i w:val="false"/>
-                <w:b w:val="false"/>
-                <w:u w:val="none"/>
-                <w:strike w:val="false"/>
-                <w:color w:val="000000"/>
-              </w:rPr>
-            </w:pPr>
-            <w:r>
-              <w:rPr>
-                <w:rFonts/>
-                <w:i w:val="false"/>
-                <w:b w:val="false"/>
-                <w:u w:val="none"/>
-                <w:strike w:val="false"/>
-                <w:color w:val="000000"/>
-              </w:rPr>
-              <w:t xml:space="preserve">32 (33)</w:t>
-            </w:r>
-          </w:p>
-        </w:tc>
-        <w:tc>
-          <w:tcPr>
-            <w:tcBorders>
-              <w:bottom w:val="single" w:sz="4" w:space="0" w:color="000000"/>
-              <w:top w:val="single" w:sz="4" w:space="0" w:color="000000"/>
-              <w:left w:val="single" w:sz="4" w:space="0" w:color="000000"/>
-              <w:right w:val="single" w:sz="4" w:space="0" w:color="000000"/>
-            </w:tcBorders>
-            <w:shd w:val="clear" w:color="auto" w:fill="FFFFFF"/>
-            <w:tcMar>
-              <w:top w:w="0" w:type="dxa"/>
-              <w:bottom w:w="0" w:type="dxa"/>
-              <w:left w:w="0" w:type="dxa"/>
-              <w:right w:w="0" w:type="dxa"/>
-            </w:tcMar>
-            <w:vAlign w:val="center"/>
-          </w:tcPr>
-          <w:p>
-            <w:pPr>
-              <w:pStyle w:val="Normal"/>
-              <w:jc w:val="center"/>
-              <w:pBdr>
-                <w:bottom w:val="none" w:sz="0" w:space="0" w:color="000000"/>
-                <w:top w:val="none" w:sz="0" w:space="0" w:color="000000"/>
-                <w:left w:val="none" w:sz="0" w:space="0" w:color="000000"/>
-                <w:right w:val="none" w:sz="0" w:space="0" w:color="000000"/>
-              </w:pBdr>
-              <w:spacing w:after="100" w:before="100" w:line="240"/>
-              <w:ind w:left="100" w:right="100" w:firstLine="0" w:firstLineChars="0"/>
-              <w:rPr>
-                <w:rFonts/>
-                <w:i w:val="false"/>
-                <w:b w:val="false"/>
-                <w:u w:val="none"/>
-                <w:strike w:val="false"/>
-                <w:color w:val="000000"/>
-              </w:rPr>
-            </w:pPr>
-            <w:r>
-              <w:rPr>
-                <w:rFonts/>
-                <w:i w:val="false"/>
-                <w:b w:val="false"/>
-                <w:u w:val="none"/>
-                <w:strike w:val="false"/>
-                <w:color w:val="000000"/>
-              </w:rPr>
-              <w:t xml:space="preserve">36 (35)</w:t>
+              <w:t xml:space="preserve">68(34)</w:t>
+            </w:r>
+          </w:p>
+        </w:tc>
+        <w:tc>
+          <w:tcPr>
+            <w:tcBorders>
+              <w:bottom w:val="single" w:sz="4" w:space="0" w:color="000000"/>
+              <w:top w:val="single" w:sz="4" w:space="0" w:color="000000"/>
+              <w:left w:val="single" w:sz="4" w:space="0" w:color="000000"/>
+              <w:right w:val="single" w:sz="4" w:space="0" w:color="000000"/>
+            </w:tcBorders>
+            <w:shd w:val="clear" w:color="auto" w:fill="FFFFFF"/>
+            <w:tcMar>
+              <w:top w:w="0" w:type="dxa"/>
+              <w:bottom w:w="0" w:type="dxa"/>
+              <w:left w:w="0" w:type="dxa"/>
+              <w:right w:w="0" w:type="dxa"/>
+            </w:tcMar>
+            <w:vAlign w:val="center"/>
+          </w:tcPr>
+          <w:p>
+            <w:pPr>
+              <w:pStyle w:val="Normal"/>
+              <w:jc w:val="center"/>
+              <w:pBdr>
+                <w:bottom w:val="none" w:sz="0" w:space="0" w:color="000000"/>
+                <w:top w:val="none" w:sz="0" w:space="0" w:color="000000"/>
+                <w:left w:val="none" w:sz="0" w:space="0" w:color="000000"/>
+                <w:right w:val="none" w:sz="0" w:space="0" w:color="000000"/>
+              </w:pBdr>
+              <w:spacing w:after="100" w:before="100" w:line="240"/>
+              <w:ind w:left="100" w:right="100" w:firstLine="0" w:firstLineChars="0"/>
+              <w:rPr>
+                <w:rFonts/>
+                <w:i w:val="false"/>
+                <w:b w:val="false"/>
+                <w:u w:val="none"/>
+                <w:strike w:val="false"/>
+                <w:color w:val="000000"/>
+              </w:rPr>
+            </w:pPr>
+            <w:r>
+              <w:rPr>
+                <w:rFonts/>
+                <w:i w:val="false"/>
+                <w:b w:val="false"/>
+                <w:u w:val="none"/>
+                <w:strike w:val="false"/>
+                <w:color w:val="000000"/>
+              </w:rPr>
+              <w:t xml:space="preserve">32(33)</w:t>
+            </w:r>
+          </w:p>
+        </w:tc>
+        <w:tc>
+          <w:tcPr>
+            <w:tcBorders>
+              <w:bottom w:val="single" w:sz="4" w:space="0" w:color="000000"/>
+              <w:top w:val="single" w:sz="4" w:space="0" w:color="000000"/>
+              <w:left w:val="single" w:sz="4" w:space="0" w:color="000000"/>
+              <w:right w:val="single" w:sz="4" w:space="0" w:color="000000"/>
+            </w:tcBorders>
+            <w:shd w:val="clear" w:color="auto" w:fill="FFFFFF"/>
+            <w:tcMar>
+              <w:top w:w="0" w:type="dxa"/>
+              <w:bottom w:w="0" w:type="dxa"/>
+              <w:left w:w="0" w:type="dxa"/>
+              <w:right w:w="0" w:type="dxa"/>
+            </w:tcMar>
+            <w:vAlign w:val="center"/>
+          </w:tcPr>
+          <w:p>
+            <w:pPr>
+              <w:pStyle w:val="Normal"/>
+              <w:jc w:val="center"/>
+              <w:pBdr>
+                <w:bottom w:val="none" w:sz="0" w:space="0" w:color="000000"/>
+                <w:top w:val="none" w:sz="0" w:space="0" w:color="000000"/>
+                <w:left w:val="none" w:sz="0" w:space="0" w:color="000000"/>
+                <w:right w:val="none" w:sz="0" w:space="0" w:color="000000"/>
+              </w:pBdr>
+              <w:spacing w:after="100" w:before="100" w:line="240"/>
+              <w:ind w:left="100" w:right="100" w:firstLine="0" w:firstLineChars="0"/>
+              <w:rPr>
+                <w:rFonts/>
+                <w:i w:val="false"/>
+                <w:b w:val="false"/>
+                <w:u w:val="none"/>
+                <w:strike w:val="false"/>
+                <w:color w:val="000000"/>
+              </w:rPr>
+            </w:pPr>
+            <w:r>
+              <w:rPr>
+                <w:rFonts/>
+                <w:i w:val="false"/>
+                <w:b w:val="false"/>
+                <w:u w:val="none"/>
+                <w:strike w:val="false"/>
+                <w:color w:val="000000"/>
+              </w:rPr>
+              <w:t xml:space="preserve">36(35)</w:t>
             </w:r>
           </w:p>
         </w:tc>
@@ -4031,109 +4031,109 @@
                 <w:strike w:val="false"/>
                 <w:color w:val="000000"/>
               </w:rPr>
-              <w:t xml:space="preserve">64 (32)</w:t>
-            </w:r>
-          </w:p>
-        </w:tc>
-        <w:tc>
-          <w:tcPr>
-            <w:tcBorders>
-              <w:bottom w:val="single" w:sz="4" w:space="0" w:color="000000"/>
-              <w:top w:val="single" w:sz="4" w:space="0" w:color="000000"/>
-              <w:left w:val="single" w:sz="4" w:space="0" w:color="000000"/>
-              <w:right w:val="single" w:sz="4" w:space="0" w:color="000000"/>
-            </w:tcBorders>
-            <w:shd w:val="clear" w:color="auto" w:fill="FFFFFF"/>
-            <w:tcMar>
-              <w:top w:w="0" w:type="dxa"/>
-              <w:bottom w:w="0" w:type="dxa"/>
-              <w:left w:w="0" w:type="dxa"/>
-              <w:right w:w="0" w:type="dxa"/>
-            </w:tcMar>
-            <w:vAlign w:val="center"/>
-          </w:tcPr>
-          <w:p>
-            <w:pPr>
-              <w:pStyle w:val="Normal"/>
-              <w:jc w:val="center"/>
-              <w:pBdr>
-                <w:bottom w:val="none" w:sz="0" w:space="0" w:color="000000"/>
-                <w:top w:val="none" w:sz="0" w:space="0" w:color="000000"/>
-                <w:left w:val="none" w:sz="0" w:space="0" w:color="000000"/>
-                <w:right w:val="none" w:sz="0" w:space="0" w:color="000000"/>
-              </w:pBdr>
-              <w:spacing w:after="100" w:before="100" w:line="240"/>
-              <w:ind w:left="100" w:right="100" w:firstLine="0" w:firstLineChars="0"/>
-              <w:rPr>
-                <w:rFonts/>
-                <w:i w:val="false"/>
-                <w:b w:val="false"/>
-                <w:u w:val="none"/>
-                <w:strike w:val="false"/>
-                <w:color w:val="000000"/>
-              </w:rPr>
-            </w:pPr>
-            <w:r>
-              <w:rPr>
-                <w:rFonts/>
-                <w:i w:val="false"/>
-                <w:b w:val="false"/>
-                <w:u w:val="none"/>
-                <w:strike w:val="false"/>
-                <w:color w:val="000000"/>
-              </w:rPr>
-              <w:t xml:space="preserve">31 (32)</w:t>
-            </w:r>
-          </w:p>
-        </w:tc>
-        <w:tc>
-          <w:tcPr>
-            <w:tcBorders>
-              <w:bottom w:val="single" w:sz="4" w:space="0" w:color="000000"/>
-              <w:top w:val="single" w:sz="4" w:space="0" w:color="000000"/>
-              <w:left w:val="single" w:sz="4" w:space="0" w:color="000000"/>
-              <w:right w:val="single" w:sz="4" w:space="0" w:color="000000"/>
-            </w:tcBorders>
-            <w:shd w:val="clear" w:color="auto" w:fill="FFFFFF"/>
-            <w:tcMar>
-              <w:top w:w="0" w:type="dxa"/>
-              <w:bottom w:w="0" w:type="dxa"/>
-              <w:left w:w="0" w:type="dxa"/>
-              <w:right w:w="0" w:type="dxa"/>
-            </w:tcMar>
-            <w:vAlign w:val="center"/>
-          </w:tcPr>
-          <w:p>
-            <w:pPr>
-              <w:pStyle w:val="Normal"/>
-              <w:jc w:val="center"/>
-              <w:pBdr>
-                <w:bottom w:val="none" w:sz="0" w:space="0" w:color="000000"/>
-                <w:top w:val="none" w:sz="0" w:space="0" w:color="000000"/>
-                <w:left w:val="none" w:sz="0" w:space="0" w:color="000000"/>
-                <w:right w:val="none" w:sz="0" w:space="0" w:color="000000"/>
-              </w:pBdr>
-              <w:spacing w:after="100" w:before="100" w:line="240"/>
-              <w:ind w:left="100" w:right="100" w:firstLine="0" w:firstLineChars="0"/>
-              <w:rPr>
-                <w:rFonts/>
-                <w:i w:val="false"/>
-                <w:b w:val="false"/>
-                <w:u w:val="none"/>
-                <w:strike w:val="false"/>
-                <w:color w:val="000000"/>
-              </w:rPr>
-            </w:pPr>
-            <w:r>
-              <w:rPr>
-                <w:rFonts/>
-                <w:i w:val="false"/>
-                <w:b w:val="false"/>
-                <w:u w:val="none"/>
-                <w:strike w:val="false"/>
-                <w:color w:val="000000"/>
-              </w:rPr>
-              <w:t xml:space="preserve">33 (32)</w:t>
+              <w:t xml:space="preserve">64(32)</w:t>
+            </w:r>
+          </w:p>
+        </w:tc>
+        <w:tc>
+          <w:tcPr>
+            <w:tcBorders>
+              <w:bottom w:val="single" w:sz="4" w:space="0" w:color="000000"/>
+              <w:top w:val="single" w:sz="4" w:space="0" w:color="000000"/>
+              <w:left w:val="single" w:sz="4" w:space="0" w:color="000000"/>
+              <w:right w:val="single" w:sz="4" w:space="0" w:color="000000"/>
+            </w:tcBorders>
+            <w:shd w:val="clear" w:color="auto" w:fill="FFFFFF"/>
+            <w:tcMar>
+              <w:top w:w="0" w:type="dxa"/>
+              <w:bottom w:w="0" w:type="dxa"/>
+              <w:left w:w="0" w:type="dxa"/>
+              <w:right w:w="0" w:type="dxa"/>
+            </w:tcMar>
+            <w:vAlign w:val="center"/>
+          </w:tcPr>
+          <w:p>
+            <w:pPr>
+              <w:pStyle w:val="Normal"/>
+              <w:jc w:val="center"/>
+              <w:pBdr>
+                <w:bottom w:val="none" w:sz="0" w:space="0" w:color="000000"/>
+                <w:top w:val="none" w:sz="0" w:space="0" w:color="000000"/>
+                <w:left w:val="none" w:sz="0" w:space="0" w:color="000000"/>
+                <w:right w:val="none" w:sz="0" w:space="0" w:color="000000"/>
+              </w:pBdr>
+              <w:spacing w:after="100" w:before="100" w:line="240"/>
+              <w:ind w:left="100" w:right="100" w:firstLine="0" w:firstLineChars="0"/>
+              <w:rPr>
+                <w:rFonts/>
+                <w:i w:val="false"/>
+                <w:b w:val="false"/>
+                <w:u w:val="none"/>
+                <w:strike w:val="false"/>
+                <w:color w:val="000000"/>
+              </w:rPr>
+            </w:pPr>
+            <w:r>
+              <w:rPr>
+                <w:rFonts/>
+                <w:i w:val="false"/>
+                <w:b w:val="false"/>
+                <w:u w:val="none"/>
+                <w:strike w:val="false"/>
+                <w:color w:val="000000"/>
+              </w:rPr>
+              <w:t xml:space="preserve">31(32)</w:t>
+            </w:r>
+          </w:p>
+        </w:tc>
+        <w:tc>
+          <w:tcPr>
+            <w:tcBorders>
+              <w:bottom w:val="single" w:sz="4" w:space="0" w:color="000000"/>
+              <w:top w:val="single" w:sz="4" w:space="0" w:color="000000"/>
+              <w:left w:val="single" w:sz="4" w:space="0" w:color="000000"/>
+              <w:right w:val="single" w:sz="4" w:space="0" w:color="000000"/>
+            </w:tcBorders>
+            <w:shd w:val="clear" w:color="auto" w:fill="FFFFFF"/>
+            <w:tcMar>
+              <w:top w:w="0" w:type="dxa"/>
+              <w:bottom w:w="0" w:type="dxa"/>
+              <w:left w:w="0" w:type="dxa"/>
+              <w:right w:w="0" w:type="dxa"/>
+            </w:tcMar>
+            <w:vAlign w:val="center"/>
+          </w:tcPr>
+          <w:p>
+            <w:pPr>
+              <w:pStyle w:val="Normal"/>
+              <w:jc w:val="center"/>
+              <w:pBdr>
+                <w:bottom w:val="none" w:sz="0" w:space="0" w:color="000000"/>
+                <w:top w:val="none" w:sz="0" w:space="0" w:color="000000"/>
+                <w:left w:val="none" w:sz="0" w:space="0" w:color="000000"/>
+                <w:right w:val="none" w:sz="0" w:space="0" w:color="000000"/>
+              </w:pBdr>
+              <w:spacing w:after="100" w:before="100" w:line="240"/>
+              <w:ind w:left="100" w:right="100" w:firstLine="0" w:firstLineChars="0"/>
+              <w:rPr>
+                <w:rFonts/>
+                <w:i w:val="false"/>
+                <w:b w:val="false"/>
+                <w:u w:val="none"/>
+                <w:strike w:val="false"/>
+                <w:color w:val="000000"/>
+              </w:rPr>
+            </w:pPr>
+            <w:r>
+              <w:rPr>
+                <w:rFonts/>
+                <w:i w:val="false"/>
+                <w:b w:val="false"/>
+                <w:u w:val="none"/>
+                <w:strike w:val="false"/>
+                <w:color w:val="000000"/>
+              </w:rPr>
+              <w:t xml:space="preserve">33(32)</w:t>
             </w:r>
           </w:p>
         </w:tc>

</xml_diff>